<commit_message>
Actualización de firmas administrativos, formatos de planillas e inserción de horas en servicio de apoyo docente
</commit_message>
<xml_diff>
--- a/data/modelos/conformidad_admin_contrato.docx
+++ b/data/modelos/conformidad_admin_contrato.docx
@@ -190,7 +190,7 @@
           <w:sz w:val="24"/>
           <w:szCs w:val="24"/>
         </w:rPr>
-        <w:t>3 de abril de 2026</w:t>
+        <w:t>29 de mayo de 2026</w:t>
       </w:r>
       <w:r>
         <w:rPr>
@@ -233,16 +233,7 @@
           <w:sz w:val="24"/>
           <w:szCs w:val="24"/>
         </w:rPr>
-        <w:t xml:space="preserve">Por medio de la presente se deja constancia de que </w:t>
-      </w:r>
-      <w:proofErr w:type="spellStart"/>
-      <w:r>
-        <w:rPr>
-          <w:rFonts w:ascii="Garamond" w:hAnsi="Garamond"/>
-          <w:sz w:val="24"/>
-          <w:szCs w:val="24"/>
-        </w:rPr>
-        <w:t>nombre</w:t>
+        <w:t>Por medio de la presente se deja constancia de que nombre</w:t>
       </w:r>
       <w:r>
         <w:rPr>
@@ -252,52 +243,54 @@
         </w:rPr>
         <w:t>_docente</w:t>
       </w:r>
-      <w:proofErr w:type="spellEnd"/>
-      <w:r>
-        <w:rPr>
-          <w:rFonts w:ascii="Garamond" w:hAnsi="Garamond"/>
-          <w:sz w:val="24"/>
-          <w:szCs w:val="24"/>
-        </w:rPr>
-        <w:t xml:space="preserve">, con RUC N.º ruc, ha realizado satisfactoriamente el </w:t>
-      </w:r>
-      <w:proofErr w:type="spellStart"/>
-      <w:r>
-        <w:rPr>
-          <w:rFonts w:ascii="Garamond" w:hAnsi="Garamond"/>
-          <w:sz w:val="24"/>
-          <w:szCs w:val="24"/>
-        </w:rPr>
-        <w:t>descripcion_cursos</w:t>
-      </w:r>
-      <w:proofErr w:type="spellEnd"/>
-      <w:r>
-        <w:rPr>
-          <w:rFonts w:ascii="Garamond" w:hAnsi="Garamond"/>
-          <w:sz w:val="24"/>
-          <w:szCs w:val="24"/>
-        </w:rPr>
-        <w:t xml:space="preserve"> en el Centro de Idiomas de la FLCH, según orden de servicio N.º ________, y en cumplimiento de la </w:t>
-      </w:r>
-      <w:proofErr w:type="spellStart"/>
-      <w:r>
-        <w:rPr>
-          <w:rFonts w:ascii="Garamond" w:hAnsi="Garamond"/>
-          <w:sz w:val="24"/>
-          <w:szCs w:val="24"/>
-        </w:rPr>
-        <w:t>numero_armada</w:t>
-      </w:r>
-      <w:proofErr w:type="spellEnd"/>
-      <w:r>
-        <w:rPr>
-          <w:rFonts w:ascii="Garamond" w:hAnsi="Garamond"/>
-          <w:sz w:val="24"/>
-          <w:szCs w:val="24"/>
-        </w:rPr>
-        <w:t xml:space="preserve"> armada del contrato de locación de servicios N.º </w:t>
-      </w:r>
-      <w:proofErr w:type="spellStart"/>
+      <w:r>
+        <w:rPr>
+          <w:rFonts w:ascii="Garamond" w:hAnsi="Garamond"/>
+          <w:sz w:val="24"/>
+          <w:szCs w:val="24"/>
+        </w:rPr>
+        <w:t xml:space="preserve">, con RUC N.º ruc, ha realizado satisfactoriamente el descripcion_cursos </w:t>
+      </w:r>
+      <w:r>
+        <w:rPr>
+          <w:rFonts w:ascii="Garamond" w:hAnsi="Garamond"/>
+          <w:sz w:val="24"/>
+          <w:szCs w:val="24"/>
+        </w:rPr>
+        <w:t xml:space="preserve">para </w:t>
+      </w:r>
+      <w:r>
+        <w:rPr>
+          <w:rFonts w:ascii="Garamond" w:hAnsi="Garamond"/>
+          <w:sz w:val="24"/>
+          <w:szCs w:val="24"/>
+        </w:rPr>
+        <w:t xml:space="preserve">el Centro de Idiomas de la </w:t>
+      </w:r>
+      <w:r>
+        <w:rPr>
+          <w:rFonts w:ascii="Garamond" w:hAnsi="Garamond"/>
+          <w:sz w:val="24"/>
+          <w:szCs w:val="24"/>
+        </w:rPr>
+        <w:t xml:space="preserve">Facultad de Letras </w:t>
+      </w:r>
+      <w:r>
+        <w:rPr>
+          <w:rFonts w:ascii="Garamond" w:hAnsi="Garamond"/>
+          <w:sz w:val="24"/>
+          <w:szCs w:val="24"/>
+        </w:rPr>
+        <w:t>bajo la modalidad presencial</w:t>
+      </w:r>
+      <w:r>
+        <w:rPr>
+          <w:rFonts w:ascii="Garamond" w:hAnsi="Garamond"/>
+          <w:sz w:val="24"/>
+          <w:szCs w:val="24"/>
+        </w:rPr>
+        <w:t xml:space="preserve">, según orden de servicio N.º ________, y en cumplimiento de la numero_armada armada del contrato de locación de servicios N.º </w:t>
+      </w:r>
       <w:r>
         <w:rPr>
           <w:rFonts w:ascii="Garamond" w:hAnsi="Garamond"/>
@@ -306,7 +299,6 @@
         </w:rPr>
         <w:t>numero_contrato</w:t>
       </w:r>
-      <w:proofErr w:type="spellEnd"/>
       <w:r>
         <w:rPr>
           <w:rFonts w:ascii="Garamond" w:hAnsi="Garamond"/>
@@ -337,41 +329,7 @@
           <w:sz w:val="24"/>
           <w:szCs w:val="24"/>
         </w:rPr>
-        <w:t xml:space="preserve"> por el importe de </w:t>
-      </w:r>
-      <w:proofErr w:type="spellStart"/>
-      <w:r>
-        <w:rPr>
-          <w:rFonts w:ascii="Garamond" w:hAnsi="Garamond"/>
-          <w:sz w:val="24"/>
-          <w:szCs w:val="24"/>
-        </w:rPr>
-        <w:t>monto_subtotal</w:t>
-      </w:r>
-      <w:proofErr w:type="spellEnd"/>
-      <w:r>
-        <w:rPr>
-          <w:rFonts w:ascii="Garamond" w:hAnsi="Garamond"/>
-          <w:sz w:val="24"/>
-          <w:szCs w:val="24"/>
-        </w:rPr>
-        <w:t xml:space="preserve">, bajo la modalidad </w:t>
-      </w:r>
-      <w:r>
-        <w:rPr>
-          <w:rFonts w:ascii="Garamond" w:hAnsi="Garamond"/>
-          <w:sz w:val="24"/>
-          <w:szCs w:val="24"/>
-        </w:rPr>
-        <w:t>presencial</w:t>
-      </w:r>
-      <w:r>
-        <w:rPr>
-          <w:rFonts w:ascii="Garamond" w:hAnsi="Garamond"/>
-          <w:sz w:val="24"/>
-          <w:szCs w:val="24"/>
-        </w:rPr>
-        <w:t>.</w:t>
+        <w:t xml:space="preserve"> por el importe de monto_subtotal.</w:t>
       </w:r>
     </w:p>
     <w:p>

</xml_diff>